<commit_message>
docs: zero-budget deployment path (Render free tier + GitHub Actions crons)
Replace Railway (~5 USD/mo) with Render's free tier in the tutorial (all four
formats regenerated) and PRODUCTION-PLAN.md. RGPD crons move to a GitHub
Actions workflow (.github/workflows/crons.yml, included — only the
DATABASE_URL repo secret is needed). Documents the free-tier sleep/cold-start
limitation and the UptimeRobot keep-alive ping. Fixed cost: 0 EUR; only
Stripe's per-sale commission remains.

Co-Authored-By: Claude Fable 5 <noreply@anthropic.com>
</commit_message>
<xml_diff>
--- a/docs/TUTO-MISE-EN-PRODUCTION.docx
+++ b/docs/TUTO-MISE-EN-PRODUCTION.docx
@@ -187,7 +187,7 @@
                 <w:bCs/>
                 <w:color w:val="0F766E"/>
               </w:rPr>
-              <w:t xml:space="preserve">Coût de départ</w:t>
+              <w:t xml:space="preserve">Coût</w:t>
             </w:r>
           </w:p>
         </w:tc>
@@ -233,7 +233,7 @@
           </w:tcPr>
           <w:p>
             <w:r>
-              <w:t xml:space="preserve">TiDB Serverless (ou OVH MySQL)</w:t>
+              <w:t xml:space="preserve">TiDB Serverless</w:t>
             </w:r>
           </w:p>
         </w:tc>
@@ -277,7 +277,7 @@
           </w:tcPr>
           <w:p>
             <w:r>
-              <w:t xml:space="preserve">Gratuit (serverless)</w:t>
+              <w:t xml:space="preserve">0 € (jusqu'à 5 Go)</w:t>
             </w:r>
           </w:p>
         </w:tc>
@@ -323,7 +323,7 @@
           </w:tcPr>
           <w:p>
             <w:r>
-              <w:t xml:space="preserve">Railway (ou Fly.io)</w:t>
+              <w:t xml:space="preserve">Render (free tier)</w:t>
             </w:r>
           </w:p>
         </w:tc>
@@ -345,7 +345,7 @@
           </w:tcPr>
           <w:p>
             <w:r>
-              <w:t xml:space="preserve">railway.app</w:t>
+              <w:t xml:space="preserve">render.com</w:t>
             </w:r>
           </w:p>
         </w:tc>
@@ -367,7 +367,7 @@
           </w:tcPr>
           <w:p>
             <w:r>
-              <w:t xml:space="preserve">~5 $/mois</w:t>
+              <w:t xml:space="preserve">0 €</w:t>
             </w:r>
           </w:p>
         </w:tc>
@@ -391,7 +391,7 @@
           </w:tcPr>
           <w:p>
             <w:r>
-              <w:t xml:space="preserve">3. Paiements</w:t>
+              <w:t xml:space="preserve">2bis. Crons RGPD</w:t>
             </w:r>
           </w:p>
         </w:tc>
@@ -413,7 +413,7 @@
           </w:tcPr>
           <w:p>
             <w:r>
-              <w:t xml:space="preserve">Stripe</w:t>
+              <w:t xml:space="preserve">GitHub Actions</w:t>
             </w:r>
           </w:p>
         </w:tc>
@@ -435,7 +435,7 @@
           </w:tcPr>
           <w:p>
             <w:r>
-              <w:t xml:space="preserve">stripe.com</w:t>
+              <w:t xml:space="preserve">déjà en place</w:t>
             </w:r>
           </w:p>
         </w:tc>
@@ -457,7 +457,7 @@
           </w:tcPr>
           <w:p>
             <w:r>
-              <w:t xml:space="preserve">Commission/transaction</w:t>
+              <w:t xml:space="preserve">0 €</w:t>
             </w:r>
           </w:p>
         </w:tc>
@@ -481,6 +481,96 @@
           </w:tcPr>
           <w:p>
             <w:r>
+              <w:t xml:space="preserve">3. Paiements</w:t>
+            </w:r>
+          </w:p>
+        </w:tc>
+        <w:tc>
+          <w:tcPr>
+            <w:tcW w:type="dxa" w:w="2800"/>
+            <w:tcBorders>
+              <w:top w:val="single" w:color="CCCCCC" w:sz="1"/>
+              <w:left w:val="single" w:color="CCCCCC" w:sz="1"/>
+              <w:bottom w:val="single" w:color="CCCCCC" w:sz="1"/>
+              <w:right w:val="single" w:color="CCCCCC" w:sz="1"/>
+            </w:tcBorders>
+            <w:tcMar>
+              <w:top w:type="dxa" w:w="80"/>
+              <w:left w:type="dxa" w:w="120"/>
+              <w:bottom w:type="dxa" w:w="80"/>
+              <w:right w:type="dxa" w:w="120"/>
+            </w:tcMar>
+          </w:tcPr>
+          <w:p>
+            <w:r>
+              <w:t xml:space="preserve">Stripe</w:t>
+            </w:r>
+          </w:p>
+        </w:tc>
+        <w:tc>
+          <w:tcPr>
+            <w:tcW w:type="dxa" w:w="2200"/>
+            <w:tcBorders>
+              <w:top w:val="single" w:color="CCCCCC" w:sz="1"/>
+              <w:left w:val="single" w:color="CCCCCC" w:sz="1"/>
+              <w:bottom w:val="single" w:color="CCCCCC" w:sz="1"/>
+              <w:right w:val="single" w:color="CCCCCC" w:sz="1"/>
+            </w:tcBorders>
+            <w:tcMar>
+              <w:top w:type="dxa" w:w="80"/>
+              <w:left w:type="dxa" w:w="120"/>
+              <w:bottom w:type="dxa" w:w="80"/>
+              <w:right w:type="dxa" w:w="120"/>
+            </w:tcMar>
+          </w:tcPr>
+          <w:p>
+            <w:r>
+              <w:t xml:space="preserve">stripe.com</w:t>
+            </w:r>
+          </w:p>
+        </w:tc>
+        <w:tc>
+          <w:tcPr>
+            <w:tcW w:type="dxa" w:w="1926"/>
+            <w:tcBorders>
+              <w:top w:val="single" w:color="CCCCCC" w:sz="1"/>
+              <w:left w:val="single" w:color="CCCCCC" w:sz="1"/>
+              <w:bottom w:val="single" w:color="CCCCCC" w:sz="1"/>
+              <w:right w:val="single" w:color="CCCCCC" w:sz="1"/>
+            </w:tcBorders>
+            <w:tcMar>
+              <w:top w:type="dxa" w:w="80"/>
+              <w:left w:type="dxa" w:w="120"/>
+              <w:bottom w:type="dxa" w:w="80"/>
+              <w:right w:type="dxa" w:w="120"/>
+            </w:tcMar>
+          </w:tcPr>
+          <w:p>
+            <w:r>
+              <w:t xml:space="preserve">0 € fixe (commission par vente)</w:t>
+            </w:r>
+          </w:p>
+        </w:tc>
+      </w:tr>
+      <w:tr>
+        <w:tc>
+          <w:tcPr>
+            <w:tcW w:type="dxa" w:w="2100"/>
+            <w:tcBorders>
+              <w:top w:val="single" w:color="CCCCCC" w:sz="1"/>
+              <w:left w:val="single" w:color="CCCCCC" w:sz="1"/>
+              <w:bottom w:val="single" w:color="CCCCCC" w:sz="1"/>
+              <w:right w:val="single" w:color="CCCCCC" w:sz="1"/>
+            </w:tcBorders>
+            <w:tcMar>
+              <w:top w:type="dxa" w:w="80"/>
+              <w:left w:type="dxa" w:w="120"/>
+              <w:bottom w:type="dxa" w:w="80"/>
+              <w:right w:type="dxa" w:w="120"/>
+            </w:tcMar>
+          </w:tcPr>
+          <w:p>
+            <w:r>
               <w:t xml:space="preserve">4. Monitoring</w:t>
             </w:r>
           </w:p>
@@ -547,7 +637,7 @@
           </w:tcPr>
           <w:p>
             <w:r>
-              <w:t xml:space="preserve">Gratuit (tier free)</w:t>
+              <w:t xml:space="preserve">0 € (tiers free)</w:t>
             </w:r>
           </w:p>
         </w:tc>
@@ -557,6 +647,40 @@
       <w:pPr>
         <w:spacing w:after="120"/>
       </w:pPr>
+    </w:p>
+    <w:p>
+      <w:pPr>
+        <w:shd w:fill="F0FDF4" w:val="clear"/>
+        <w:spacing w:after="120" w:before="120"/>
+        <w:ind w:left="240"/>
+      </w:pPr>
+      <w:r>
+        <w:rPr>
+          <w:b/>
+          <w:bCs/>
+        </w:rPr>
+        <w:t xml:space="preserve">✅ Budget total : 0 € de coût fixe. </w:t>
+      </w:r>
+      <w:r>
+        <w:t xml:space="preserve">Tu ne paies que la commission Stripe (~1,5 % + 0,25 €) quand un client paie réellement.</w:t>
+      </w:r>
+    </w:p>
+    <w:p>
+      <w:pPr>
+        <w:shd w:fill="FFFBEB" w:val="clear"/>
+        <w:spacing w:after="120" w:before="120"/>
+        <w:ind w:left="240"/>
+      </w:pPr>
+      <w:r>
+        <w:rPr>
+          <w:b/>
+          <w:bCs/>
+        </w:rPr>
+        <w:t xml:space="preserve">⚠ Limite du tier gratuit Render : </w:t>
+      </w:r>
+      <w:r>
+        <w:t xml:space="preserve">le serveur s'endort après 15 min sans trafic et met ~50 s à se réveiller. Le ping UptimeRobot toutes les 5 min (étape 4.2) le maintient éveillé en pratique. Quand les premiers clients arrivent, passe au plan Starter (~7 $/mois).</w:t>
+      </w:r>
     </w:p>
     <w:p>
       <w:pPr>
@@ -929,7 +1053,7 @@
         <w:pStyle w:val="Heading1"/>
       </w:pPr>
       <w:r>
-        <w:t xml:space="preserve">Étape 2 — L'hébergement (~45 min)</w:t>
+        <w:t xml:space="preserve">Étape 2 — L'hébergement gratuit sur Render (~45 min)</w:t>
       </w:r>
     </w:p>
     <w:p>
@@ -944,10 +1068,10 @@
           <w:b/>
           <w:bCs/>
         </w:rPr>
-        <w:t xml:space="preserve">Railway</w:t>
-      </w:r>
-      <w:r>
-        <w:t xml:space="preserve"> est le plus simple pour un premier déploiement.</w:t>
+        <w:t xml:space="preserve">Render</w:t>
+      </w:r>
+      <w:r>
+        <w:t xml:space="preserve"> offre un tier gratuit qui suffit pour démarrer.</w:t>
       </w:r>
     </w:p>
     <w:p>
@@ -955,7 +1079,7 @@
         <w:pStyle w:val="Heading2"/>
       </w:pPr>
       <w:r>
-        <w:t xml:space="preserve">2.1 Créer le projet Railway</w:t>
+        <w:t xml:space="preserve">2.1 Créer le service Render</w:t>
       </w:r>
     </w:p>
     <w:p>
@@ -975,10 +1099,10 @@
           <w:b/>
           <w:bCs/>
         </w:rPr>
-        <w:t xml:space="preserve">https://railway.app</w:t>
-      </w:r>
-      <w:r>
-        <w:t xml:space="preserve"> → Login with GitHub.</w:t>
+        <w:t xml:space="preserve">https://render.com</w:t>
+      </w:r>
+      <w:r>
+        <w:t xml:space="preserve"> → Sign up with GitHub.</w:t>
       </w:r>
     </w:p>
     <w:p>
@@ -995,7 +1119,7 @@
           <w:b/>
           <w:bCs/>
         </w:rPr>
-        <w:t xml:space="preserve">New Project</w:t>
+        <w:t xml:space="preserve">New</w:t>
       </w:r>
       <w:r>
         <w:t xml:space="preserve"> → </w:t>
@@ -1005,10 +1129,10 @@
           <w:b/>
           <w:bCs/>
         </w:rPr>
-        <w:t xml:space="preserve">Deploy from GitHub repo</w:t>
-      </w:r>
-      <w:r>
-        <w:t xml:space="preserve"> → choisis </w:t>
+        <w:t xml:space="preserve">Web Service</w:t>
+      </w:r>
+      <w:r>
+        <w:t xml:space="preserve"> → connecte le repo </w:t>
       </w:r>
       <w:r>
         <w:rPr>
@@ -1033,7 +1157,60 @@
         <w:spacing w:after="60"/>
       </w:pPr>
       <w:r>
-        <w:t xml:space="preserve">Railway détecte le Dockerfile automatiquement.</w:t>
+        <w:t xml:space="preserve">Render détecte le Dockerfile automatiquement (Language : </w:t>
+      </w:r>
+      <w:r>
+        <w:rPr>
+          <w:b/>
+          <w:bCs/>
+        </w:rPr>
+        <w:t xml:space="preserve">Docker</w:t>
+      </w:r>
+      <w:r>
+        <w:t xml:space="preserve">).</w:t>
+      </w:r>
+    </w:p>
+    <w:p>
+      <w:pPr>
+        <w:pStyle w:val="ListParagraph"/>
+        <w:numPr>
+          <w:ilvl w:val="0"/>
+          <w:numId w:val="3"/>
+        </w:numPr>
+        <w:spacing w:after="60"/>
+      </w:pPr>
+      <w:r>
+        <w:rPr>
+          <w:b/>
+          <w:bCs/>
+        </w:rPr>
+        <w:t xml:space="preserve">Instance Type : Free</w:t>
+      </w:r>
+      <w:r>
+        <w:t xml:space="preserve"> ← c'est là que tu choisis le 0 €.</w:t>
+      </w:r>
+    </w:p>
+    <w:p>
+      <w:pPr>
+        <w:pStyle w:val="ListParagraph"/>
+        <w:numPr>
+          <w:ilvl w:val="0"/>
+          <w:numId w:val="3"/>
+        </w:numPr>
+        <w:spacing w:after="60"/>
+      </w:pPr>
+      <w:r>
+        <w:t xml:space="preserve">Région : </w:t>
+      </w:r>
+      <w:r>
+        <w:rPr>
+          <w:b/>
+          <w:bCs/>
+        </w:rPr>
+        <w:t xml:space="preserve">Frankfurt</w:t>
+      </w:r>
+      <w:r>
+        <w:t xml:space="preserve"> (UE).</w:t>
       </w:r>
     </w:p>
     <w:p>
@@ -1049,14 +1226,14 @@
         <w:spacing w:after="120"/>
       </w:pPr>
       <w:r>
-        <w:t xml:space="preserve">Dans Railway → ton service → onglet </w:t>
-      </w:r>
-      <w:r>
-        <w:rPr>
-          <w:b/>
-          <w:bCs/>
-        </w:rPr>
-        <w:t xml:space="preserve">Variables</w:t>
+        <w:t xml:space="preserve">Dans Render → ton service → onglet </w:t>
+      </w:r>
+      <w:r>
+        <w:rPr>
+          <w:b/>
+          <w:bCs/>
+        </w:rPr>
+        <w:t xml:space="preserve">Environment</w:t>
       </w:r>
       <w:r>
         <w:t xml:space="preserve">, ajoute :</w:t>
@@ -1686,85 +1863,35 @@
           </w:p>
         </w:tc>
       </w:tr>
-      <w:tr>
-        <w:tc>
-          <w:tcPr>
-            <w:tcW w:type="dxa" w:w="2700"/>
-            <w:tcBorders>
-              <w:top w:val="single" w:color="CCCCCC" w:sz="1"/>
-              <w:left w:val="single" w:color="CCCCCC" w:sz="1"/>
-              <w:bottom w:val="single" w:color="CCCCCC" w:sz="1"/>
-              <w:right w:val="single" w:color="CCCCCC" w:sz="1"/>
-            </w:tcBorders>
-            <w:tcMar>
-              <w:top w:type="dxa" w:w="80"/>
-              <w:left w:type="dxa" w:w="120"/>
-              <w:bottom w:type="dxa" w:w="80"/>
-              <w:right w:type="dxa" w:w="120"/>
-            </w:tcMar>
-          </w:tcPr>
-          <w:p>
-            <w:r>
-              <w:rPr>
-                <w:rFonts w:ascii="Consolas" w:cs="Consolas" w:eastAsia="Consolas" w:hAnsi="Consolas"/>
-                <w:sz w:val="20"/>
-                <w:szCs w:val="20"/>
-                <w:shd w:fill="F1F5F9" w:val="clear"/>
-              </w:rPr>
-              <w:t xml:space="preserve">PORT</w:t>
-            </w:r>
-          </w:p>
-        </w:tc>
-        <w:tc>
-          <w:tcPr>
-            <w:tcW w:type="dxa" w:w="3300"/>
-            <w:tcBorders>
-              <w:top w:val="single" w:color="CCCCCC" w:sz="1"/>
-              <w:left w:val="single" w:color="CCCCCC" w:sz="1"/>
-              <w:bottom w:val="single" w:color="CCCCCC" w:sz="1"/>
-              <w:right w:val="single" w:color="CCCCCC" w:sz="1"/>
-            </w:tcBorders>
-            <w:tcMar>
-              <w:top w:type="dxa" w:w="80"/>
-              <w:left w:type="dxa" w:w="120"/>
-              <w:bottom w:type="dxa" w:w="80"/>
-              <w:right w:type="dxa" w:w="120"/>
-            </w:tcMar>
-          </w:tcPr>
-          <w:p>
-            <w:r>
-              <w:t xml:space="preserve">3000</w:t>
-            </w:r>
-          </w:p>
-        </w:tc>
-        <w:tc>
-          <w:tcPr>
-            <w:tcW w:type="dxa" w:w="3026"/>
-            <w:tcBorders>
-              <w:top w:val="single" w:color="CCCCCC" w:sz="1"/>
-              <w:left w:val="single" w:color="CCCCCC" w:sz="1"/>
-              <w:bottom w:val="single" w:color="CCCCCC" w:sz="1"/>
-              <w:right w:val="single" w:color="CCCCCC" w:sz="1"/>
-            </w:tcBorders>
-            <w:tcMar>
-              <w:top w:type="dxa" w:w="80"/>
-              <w:left w:type="dxa" w:w="120"/>
-              <w:bottom w:type="dxa" w:w="80"/>
-              <w:right w:type="dxa" w:w="120"/>
-            </w:tcMar>
-          </w:tcPr>
-          <w:p>
-            <w:r>
-              <w:t xml:space="preserve"/>
-            </w:r>
-          </w:p>
-        </w:tc>
-      </w:tr>
     </w:tbl>
     <w:p>
       <w:pPr>
         <w:spacing w:after="120"/>
       </w:pPr>
+    </w:p>
+    <w:p>
+      <w:pPr>
+        <w:spacing w:after="120"/>
+      </w:pPr>
+      <w:r>
+        <w:t xml:space="preserve">(Pas besoin de </w:t>
+      </w:r>
+      <w:r>
+        <w:rPr>
+          <w:rFonts w:ascii="Consolas" w:cs="Consolas" w:eastAsia="Consolas" w:hAnsi="Consolas"/>
+          <w:sz w:val="20"/>
+          <w:szCs w:val="20"/>
+          <w:shd w:fill="F1F5F9" w:val="clear"/>
+        </w:rPr>
+        <w:t xml:space="preserve">PORT</w:t>
+      </w:r>
+      <w:r>
+        <w:rPr>
+          <w:i/>
+          <w:iCs/>
+        </w:rPr>
+        <w:t xml:space="preserve"> : Render le fournit automatiquement et l'app le lit.)</w:t>
+      </w:r>
     </w:p>
     <w:p>
       <w:pPr>
@@ -1941,6 +2068,34 @@
     </w:p>
     <w:p>
       <w:pPr>
+        <w:spacing w:after="120"/>
+      </w:pPr>
+      <w:r>
+        <w:t xml:space="preserve">Ajoute-les aussi dans </w:t>
+      </w:r>
+      <w:r>
+        <w:rPr>
+          <w:b/>
+          <w:bCs/>
+        </w:rPr>
+        <w:t xml:space="preserve">Environment</w:t>
+      </w:r>
+      <w:r>
+        <w:t xml:space="preserve"> : Render rend les variables disponibles pendant le build Docker. Si le bouton de login pointe dans le vide après déploiement, elles manquaient au build — ajoute-les puis </w:t>
+      </w:r>
+      <w:r>
+        <w:rPr>
+          <w:b/>
+          <w:bCs/>
+        </w:rPr>
+        <w:t xml:space="preserve">Manual Deploy → Clear build cache &amp; deploy</w:t>
+      </w:r>
+      <w:r>
+        <w:t xml:space="preserve">.</w:t>
+      </w:r>
+    </w:p>
+    <w:p>
+      <w:pPr>
         <w:pStyle w:val="Heading2"/>
       </w:pPr>
       <w:r>
@@ -1957,17 +2112,7 @@
         <w:spacing w:after="60"/>
       </w:pPr>
       <w:r>
-        <w:t xml:space="preserve">Railway → </w:t>
-      </w:r>
-      <w:r>
-        <w:rPr>
-          <w:b/>
-          <w:bCs/>
-        </w:rPr>
-        <w:t xml:space="preserve">Settings → Networking → Generate Domain</w:t>
-      </w:r>
-      <w:r>
-        <w:t xml:space="preserve"> (tu obtiens xxx.up.railway.app).</w:t>
+        <w:t xml:space="preserve">Render te donne d'office un domaine gratuit en xxx.onrender.com — suffisant pour démarrer.</w:t>
       </w:r>
     </w:p>
     <w:p>
@@ -1980,7 +2125,7 @@
         <w:spacing w:after="60"/>
       </w:pPr>
       <w:r>
-        <w:t xml:space="preserve">Pour un domaine Anavim (ex. compute.anavim-infra.com) : ajoute un </w:t>
+        <w:t xml:space="preserve">(Optionnel, toujours 0 € nouveau) : pour compute.anavim-infra.com, ajoute un </w:t>
       </w:r>
       <w:r>
         <w:rPr>
@@ -1990,7 +2135,7 @@
         <w:t xml:space="preserve">Custom Domain</w:t>
       </w:r>
       <w:r>
-        <w:t xml:space="preserve"> dans Railway puis crée le CNAME indiqué dans ta zone DNS OVH. Le certificat TLS est automatique.</w:t>
+        <w:t xml:space="preserve"> dans Render → Settings puis crée le CNAME indiqué dans ta zone DNS OVH (domaine déjà payé). Certificat TLS automatique.</w:t>
       </w:r>
     </w:p>
     <w:p>
@@ -2073,7 +2218,7 @@
         <w:pStyle w:val="Heading2"/>
       </w:pPr>
       <w:r>
-        <w:t xml:space="preserve">2.5 Les crons RGPD</w:t>
+        <w:t xml:space="preserve">2.5 Les crons RGPD — gratuits via GitHub Actions</w:t>
       </w:r>
     </w:p>
     <w:p>
@@ -2081,7 +2226,39 @@
         <w:spacing w:after="120"/>
       </w:pPr>
       <w:r>
-        <w:t xml:space="preserve">Dans Railway, crée deux services « Cron Job » pointant sur le même repo :</w:t>
+        <w:t xml:space="preserve">Le tier gratuit Render n'inclut pas les cron jobs, mais </w:t>
+      </w:r>
+      <w:r>
+        <w:rPr>
+          <w:b/>
+          <w:bCs/>
+        </w:rPr>
+        <w:t xml:space="preserve">GitHub Actions</w:t>
+      </w:r>
+      <w:r>
+        <w:t xml:space="preserve"> les exécute gratuitement. Le workflow </w:t>
+      </w:r>
+      <w:r>
+        <w:rPr>
+          <w:rFonts w:ascii="Consolas" w:cs="Consolas" w:eastAsia="Consolas" w:hAnsi="Consolas"/>
+          <w:sz w:val="20"/>
+          <w:szCs w:val="20"/>
+          <w:shd w:fill="F1F5F9" w:val="clear"/>
+        </w:rPr>
+        <w:t xml:space="preserve">.github/workflows/crons.yml</w:t>
+      </w:r>
+      <w:r>
+        <w:t xml:space="preserve"> est </w:t>
+      </w:r>
+      <w:r>
+        <w:rPr>
+          <w:b/>
+          <w:bCs/>
+        </w:rPr>
+        <w:t xml:space="preserve">déjà dans le repo</w:t>
+      </w:r>
+      <w:r>
+        <w:t xml:space="preserve"> :</w:t>
       </w:r>
     </w:p>
     <w:tbl>
@@ -2259,7 +2436,7 @@
           </w:tcPr>
           <w:p>
             <w:r>
-              <w:t xml:space="preserve">tous les jours à 03:00</w:t>
+              <w:t xml:space="preserve">tous les jours à 03:00 UTC</w:t>
             </w:r>
           </w:p>
         </w:tc>
@@ -2333,12 +2510,57 @@
           </w:tcPr>
           <w:p>
             <w:r>
-              <w:t xml:space="preserve">toutes les heures</w:t>
+              <w:t xml:space="preserve">toutes les heures (à :30)</w:t>
             </w:r>
           </w:p>
         </w:tc>
       </w:tr>
     </w:tbl>
+    <w:p>
+      <w:pPr>
+        <w:spacing w:after="120"/>
+      </w:pPr>
+    </w:p>
+    <w:p>
+      <w:pPr>
+        <w:spacing w:after="120"/>
+      </w:pPr>
+      <w:r>
+        <w:t xml:space="preserve">Il te reste une seule chose à faire : GitHub → repo → </w:t>
+      </w:r>
+      <w:r>
+        <w:rPr>
+          <w:b/>
+          <w:bCs/>
+        </w:rPr>
+        <w:t xml:space="preserve">Settings → Secrets and variables → Actions</w:t>
+      </w:r>
+      <w:r>
+        <w:t xml:space="preserve"> → ajoute le secret </w:t>
+      </w:r>
+      <w:r>
+        <w:rPr>
+          <w:rFonts w:ascii="Consolas" w:cs="Consolas" w:eastAsia="Consolas" w:hAnsi="Consolas"/>
+          <w:sz w:val="20"/>
+          <w:szCs w:val="20"/>
+          <w:shd w:fill="F1F5F9" w:val="clear"/>
+        </w:rPr>
+        <w:t xml:space="preserve">DATABASE_URL</w:t>
+      </w:r>
+      <w:r>
+        <w:t xml:space="preserve"> (la même chaîne TiDB). Teste avec </w:t>
+      </w:r>
+      <w:r>
+        <w:rPr>
+          <w:b/>
+          <w:bCs/>
+        </w:rPr>
+        <w:t xml:space="preserve">Actions → RGPD crons → Run workflow</w:t>
+      </w:r>
+      <w:r>
+        <w:t xml:space="preserve">.</w:t>
+      </w:r>
+    </w:p>
     <w:p>
       <w:pPr>
         <w:pStyle w:val="Heading1"/>
@@ -2480,7 +2702,7 @@
         <w:t xml:space="preserve">STRIPE_SECRET_KEY</w:t>
       </w:r>
       <w:r>
-        <w:t xml:space="preserve"> dans Railway.</w:t>
+        <w:t xml:space="preserve"> dans Render.</w:t>
       </w:r>
     </w:p>
     <w:p>
@@ -2584,7 +2806,7 @@
         <w:spacing w:after="60"/>
       </w:pPr>
       <w:r>
-        <w:t xml:space="preserve">Redéploie (Railway le fait automatiquement quand tu changes une variable).</w:t>
+        <w:t xml:space="preserve">Redéploie (Render le fait automatiquement quand tu changes une variable).</w:t>
       </w:r>
     </w:p>
     <w:p>
@@ -2929,7 +3151,7 @@
         <w:t xml:space="preserve">SENTRY_DSN</w:t>
       </w:r>
       <w:r>
-        <w:t xml:space="preserve"> dans Railway.</w:t>
+        <w:t xml:space="preserve"> dans Render.</w:t>
       </w:r>
     </w:p>
     <w:p>
@@ -3006,6 +3228,24 @@
       </w:pPr>
       <w:r>
         <w:t xml:space="preserve">Alerte e-mail vers contact@anavim-infra.com.</w:t>
+      </w:r>
+    </w:p>
+    <w:p>
+      <w:pPr>
+        <w:spacing w:after="120"/>
+      </w:pPr>
+      <w:r>
+        <w:t xml:space="preserve">Double rôle sur le tier gratuit Render : le ping toutes les 5 min </w:t>
+      </w:r>
+      <w:r>
+        <w:rPr>
+          <w:b/>
+          <w:bCs/>
+        </w:rPr>
+        <w:t xml:space="preserve">empêche aussi le serveur de s'endormir</w:t>
+      </w:r>
+      <w:r>
+        <w:t xml:space="preserve"> (veille après 15 min d'inactivité).</w:t>
       </w:r>
     </w:p>
     <w:p>
@@ -3515,7 +3755,7 @@
           </w:tcPr>
           <w:p>
             <w:r>
-              <w:t xml:space="preserve">Vérifie la variable dans Railway ; teste integration-check en local</w:t>
+              <w:t xml:space="preserve">Vérifie la variable dans Render ; teste integration-check en local</w:t>
             </w:r>
           </w:p>
         </w:tc>

</xml_diff>